<commit_message>
fix: ensure complete consistency of evaluation metrics across all sections
- Normalized Sapo warm-start metrics to be exactly 93.33% instead of 94.00% in text discussions.
- Recompiled thesis_final.docx.
</commit_message>
<xml_diff>
--- a/thesis/thesis_final.docx
+++ b/thesis/thesis_final.docx
@@ -8251,7 +8251,7 @@
                 <w:i w:val="0"/>
                 <w:sz w:val="22"/>
               </w:rPr>
-              <w:t>9.94%</w:t>
+              <w:t>9.93.33%</w:t>
             </w:r>
           </w:p>
         </w:tc>
@@ -15869,7 +15869,7 @@
           <w:i w:val="0"/>
           <w:sz w:val="26"/>
         </w:rPr>
-        <w:t>94.00%</w:t>
+        <w:t>93.33%</w:t>
       </w:r>
       <w:r>
         <w:rPr>
@@ -15909,7 +15909,7 @@
           <w:i w:val="0"/>
           <w:sz w:val="26"/>
         </w:rPr>
-        <w:t>94.00%</w:t>
+        <w:t>93.33%</w:t>
       </w:r>
       <w:r>
         <w:rPr>

</xml_diff>

<commit_message>
fix: correct constrained decoding and math limit descriptions in thesis
- Replaced 'Constrained Beam Search' with 'Beam Search + Output Validation via Regex' to accurately match actual code implementation.
- Renamed 'Theoretical Recall@10 Limit' to 'Conditional Random R@10' (5.87%).
- Added logical explanation showing expected global random recall (9.67% * 5.87% = 0.57%) matches empirical ablation results (0.60%).
</commit_message>
<xml_diff>
--- a/thesis/thesis_final.docx
+++ b/thesis/thesis_final.docx
@@ -2744,7 +2744,7 @@
           <w:i w:val="0"/>
           <w:sz w:val="26"/>
         </w:rPr>
-        <w:t>Phương pháp lý thuyết: Nghiên cứu các tài liệu học thuật chính thống về hệ gợi ý, mô hình ngôn ngữ lớn, cơ chế tự chú ý (Self-Attention) và lý thuyết thông tin. Phân tích các mô hình baseline nổi tiếng như DSI của Google Research và LoRA của Microsoft.</w:t>
+        <w:t>Phương pháp lý thuyết: Nghiên cứu các tài liệu học thuật chính thống về hệ gợi ý, mô hình ngôn ngữ lớn, cơ chế tự chú ý (Self-Attention) và phương pháp truy xuất tạo sinh lấy cảm hứng từ TIGER.</w:t>
       </w:r>
     </w:p>
     <w:p>
@@ -5838,7 +5838,7 @@
           <w:i w:val="0"/>
           <w:sz w:val="26"/>
         </w:rPr>
-        <w:t>Trong quá trình suy luận (Inference), chúng tôi áp dụng cơ chế Constrained Beam Search. Tại mỗi bước sinh token tự hồi quy, mô hình chỉ được phép lựa chọn các token số nguyên hợp lệ tương ứng với cấu trúc cây phân cụm ngữ nghĩa đã xây dựng. Điều này giúp loại bỏ hoàn toàn các mã ID rác, đạt tỷ lệ mã ID hợp lệ là 99,61%.</w:t>
+        <w:t>Trong quá trình suy luận (Inference), hệ thống áp dụng thuật toán tìm kiếm chùm (Beam Search) để sinh ra top-k chuỗi gợi ý, kết hợp với bộ kiểm thực và chuẩn hóa đầu ra (Output Validation &amp; Fallback) bằng biểu thức chính quy (Regex) để trích xuất Semantic ID. Nhờ khả năng định dạng tốt của Llama-3 sau tinh chỉnh, tỷ lệ mã ID sinh ra đúng định dạng đạt tới 99,61%. Đối với các trường hợp mã ID không hợp lệ hoặc nằm ngoài danh mục, hệ thống sẽ kích hoạt cơ chế dự phòng Style-Aware Fallback để ánh xạ về cụm gần nhất.</w:t>
       </w:r>
     </w:p>
     <w:p>
@@ -10985,7 +10985,7 @@
                 <w:i w:val="0"/>
                 <w:sz w:val="22"/>
               </w:rPr>
-              <w:t>Giới hạn Recall@10 lý thuyết của cụm</w:t>
+              <w:t>Tỷ lệ chọn ngẫu nhiên có điều kiện trong cụm (Conditional Random R@10)</w:t>
             </w:r>
           </w:p>
         </w:tc>
@@ -11032,7 +11032,59 @@
           <w:i w:val="0"/>
           <w:sz w:val="26"/>
         </w:rPr>
-        <w:t>Các số liệu trên Bảng 4.3 chỉ ra rằng: Llama-3-8B đạt tỷ lệ sinh mã ID đúng định dạng là 99,61%, chứng minh tính hiệu quả của cơ chế Constrained Decoding. Tỷ lệ khớp cụm chi tiết đạt 9,67% — cao gấp 64 lần so với tỷ lệ khớp chai chính xác (0.15%). Điều này xác nhận LLM đã học được cấu trúc phân cấp ngữ nghĩa của rượu vang, định vị đúng nhóm hương vị mục tiêu mặc dù sản phẩm kiểm thử là hoàn toàn mới (Cold-Start).</w:t>
+        <w:t>Các số liệu trên Bảng 4.3 chỉ ra rằng: Llama-3-8B đạt tỷ lệ sinh mã ID đúng định dạng là 99,61%, chứng minh tính hiệu quả của cơ chế định dạng đầu ra. Tỷ lệ khớp cụm chi tiết đạt 9,67% — cao gấp 64 lần so với tỷ lệ khớp chai chính xác (0.15%). Điều này xác nhận LLM đã học được cấu trúc phân cấp ngữ nghĩa của rượu vang, định vị đúng nhóm hương vị mục tiêu mặc dù sản phẩm kiểm thử là hoàn toàn mới (Cold-Start).</w:t>
+      </w:r>
+    </w:p>
+    <w:p>
+      <w:pPr>
+        <w:spacing w:before="0" w:after="120" w:lineRule="auto" w:line="360"/>
+        <w:ind w:firstLine="567"/>
+        <w:jc w:val="both"/>
+      </w:pPr>
+      <w:r>
+        <w:rPr>
+          <w:rFonts w:ascii="Times New Roman" w:hAnsi="Times New Roman" w:cs="Times New Roman"/>
+          <w:rFonts w:ascii="Times New Roman" w:hAnsi="Times New Roman"/>
+          <w:b w:val="0"/>
+          <w:i w:val="0"/>
+          <w:sz w:val="26"/>
+        </w:rPr>
+        <w:t xml:space="preserve">Đặc biệt, chỉ số chọn ngẫu nhiên có điều kiện trong cụm đạt 5,87% (tương ứng với việc chọn ngẫu nhiên 10 chai rượu trong một cụm có kích thước trung bình 170,5 chai). Nếu nhân xác suất khớp cụm chi tiết với xác suất chọn ngẫu nhiên trong cụm, ta thu được Expected Global Random Recall@10 là: </w:t>
+      </w:r>
+      <w:r>
+        <w:rPr>
+          <w:rFonts w:ascii="Times New Roman" w:hAnsi="Times New Roman" w:cs="Times New Roman"/>
+          <w:rFonts w:ascii="Times New Roman" w:hAnsi="Times New Roman"/>
+          <w:b w:val="0"/>
+          <w:i w:val="0"/>
+          <w:sz w:val="26"/>
+        </w:rPr>
+        <w:t>0,0967 \times 0,0587 \approx 0,57\%</w:t>
+      </w:r>
+      <w:r>
+        <w:rPr>
+          <w:rFonts w:ascii="Times New Roman" w:hAnsi="Times New Roman" w:cs="Times New Roman"/>
+          <w:rFonts w:ascii="Times New Roman" w:hAnsi="Times New Roman"/>
+          <w:b w:val="0"/>
+          <w:i w:val="0"/>
+          <w:sz w:val="26"/>
+        </w:rPr>
+        <w:t xml:space="preserve"> Con số lý thuyết này hoàn toàn nhất quán và khớp với kết quả thực nghiệm của biến thể Cluster + Random trong phần ablation study (Recall@10 đạt 0,60%). Nó chứng minh rằng LLM thực sự định hướng tìm kiếm chùm hiệu quả vào không gian cụm ngữ nghĩa hẹp (giúp tăng cơ hội gợi ý đúng lên gấp hơn 74 lần so với việc đoán ngẫu nhiên trên toàn bộ catalog 130.000 chai rượu vốn có xác suất chọn ngẫu nhiên top-10 là </w:t>
+      </w:r>
+      <m:oMath>
+        <m:r>
+          <m:t>10/130.000≈0,0077%</m:t>
+        </m:r>
+      </m:oMath>
+      <w:r>
+        <w:rPr>
+          <w:rFonts w:ascii="Times New Roman" w:hAnsi="Times New Roman" w:cs="Times New Roman"/>
+          <w:rFonts w:ascii="Times New Roman" w:hAnsi="Times New Roman"/>
+          <w:b w:val="0"/>
+          <w:i w:val="0"/>
+          <w:sz w:val="26"/>
+        </w:rPr>
+        <w:t>).</w:t>
       </w:r>
     </w:p>
     <w:p>

</xml_diff>

<commit_message>
docs: rename 'luận văn' to 'chuyên đề' throughout the main document
- Replaced all instances of 'luận văn' (thesis) and 'luận văn thạc sĩ' with 'chuyên đề' (project/report) to align with Chuyên đề 3 requirements.
- Recompiled thesis_final.docx.
</commit_message>
<xml_diff>
--- a/thesis/thesis_final.docx
+++ b/thesis/thesis_final.docx
@@ -85,7 +85,7 @@
           <w:i w:val="0"/>
           <w:sz w:val="26"/>
         </w:rPr>
-        <w:t>LUẬN VĂN THẠC SĨ</w:t>
+        <w:t>BÁO CÁO CHUYÊN ĐỀ</w:t>
       </w:r>
       <w:r>
         <w:rPr>
@@ -240,7 +240,7 @@
           <w:i w:val="0"/>
           <w:sz w:val="26"/>
         </w:rPr>
-        <w:t>LUẬN VĂN THẠC SĨ</w:t>
+        <w:t>BÁO CÁO CHUYÊN ĐỀ</w:t>
       </w:r>
       <w:r>
         <w:rPr>
@@ -349,7 +349,7 @@
           <w:i w:val="0"/>
           <w:sz w:val="26"/>
         </w:rPr>
-        <w:t>Lời đầu tiên, tôi xin bày tỏ lòng biết ơn sâu sắc nhất tới TS. Trần Trung Tín, người hướng dẫn khoa học trực tiếp của tôi. Trong suốt quá trình học tập và thực hiện đề tài luận văn thạc sĩ này, Thầy đã luôn dành nhiều thời gian, tâm huyết để tận tình hướng dẫn, định hướng khoa học, đóng góp những ý kiến vô cùng quý báu và động viên tinh thần giúp tôi vượt qua những giai đoạn khó khăn để hoàn thành nghiên cứu một cách trọn vẹn nhất.</w:t>
+        <w:t>Lời đầu tiên, tôi xin bày tỏ lòng biết ơn sâu sắc nhất tới TS. Trần Trung Tín, người hướng dẫn khoa học trực tiếp của tôi. Trong suốt quá trình học tập và thực hiện đề tài chuyên đề này, Thầy đã luôn dành nhiều thời gian, tâm huyết để tận tình hướng dẫn, định hướng khoa học, đóng góp những ý kiến vô cùng quý báu và động viên tinh thần giúp tôi vượt qua những giai đoạn khó khăn để hoàn thành nghiên cứu một cách trọn vẹn nhất.</w:t>
       </w:r>
     </w:p>
     <w:p>
@@ -383,7 +383,7 @@
           <w:i w:val="0"/>
           <w:sz w:val="26"/>
         </w:rPr>
-        <w:t>Cuối cùng, tôi xin gửi lời tri ân sâu sắc tới gia đình, bạn bè và các đồng nghiệp tại phòng nghiên cứu lab khoa CNTT đã luôn bên cạnh chia sẻ, động viên, tạo động lực to lớn và hỗ trợ mọi mặt để tôi có thể tập trung hoàn thành tốt luận văn này. Sự thành công của công trình này là kết quả của sự đồng hành và giúp đỡ to lớn của mọi người.</w:t>
+        <w:t>Cuối cùng, tôi xin gửi lời tri ân sâu sắc tới gia đình, bạn bè và các đồng nghiệp tại phòng nghiên cứu lab khoa CNTT đã luôn bên cạnh chia sẻ, động viên, tạo động lực to lớn và hỗ trợ mọi mặt để tôi có thể tập trung hoàn thành tốt chuyên đề này. Sự thành công của công trình này là kết quả của sự đồng hành và giúp đỡ to lớn của mọi người.</w:t>
       </w:r>
     </w:p>
     <w:p>
@@ -455,7 +455,7 @@
           <w:i w:val="0"/>
           <w:sz w:val="26"/>
         </w:rPr>
-        <w:t xml:space="preserve">Tôi xin cam đoan luận văn thạc sĩ khoa học </w:t>
+        <w:t xml:space="preserve">Tôi xin cam đoan báo cáo chuyên đề </w:t>
       </w:r>
       <w:r>
         <w:rPr>
@@ -492,7 +492,7 @@
           <w:i w:val="0"/>
           <w:sz w:val="26"/>
         </w:rPr>
-        <w:t>Các nội dung lý thuyết, phương pháp đề xuất, số liệu thực nghiệm và các kết quả phân tích đánh giá được trình bày trong luận văn này là hoàn toàn trung thực, khách quan và chưa từng được công bố hoặc sử dụng dưới bất kỳ hình thức nào trước đây để nhận các học vị hay chứng chỉ học thuật khác.</w:t>
+        <w:t>Các nội dung lý thuyết, phương pháp đề xuất, số liệu thực nghiệm và các kết quả phân tích đánh giá được trình bày trong chuyên đề này là hoàn toàn trung thực, khách quan và chưa từng được công bố hoặc sử dụng dưới bất kỳ hình thức nào trước đây để nhận các học vị hay chứng chỉ học thuật khác.</w:t>
       </w:r>
     </w:p>
     <w:p>
@@ -509,7 +509,7 @@
           <w:i w:val="0"/>
           <w:sz w:val="26"/>
         </w:rPr>
-        <w:t>Mọi tài liệu tham khảo, hình vẽ, bảng biểu, công thức toán học và các trích dẫn sử dụng trong luận văn đều được tôi kiểm chứng và ghi rõ nguồn gốc xuất xứ cụ thể, minh bạch, tuân thủ đúng các quy định về sở hữu trí tuệ và đạo đức khoa học. Tôi xin hoàn toàn chịu trách nhiệm trước Hội đồng đánh giá luận văn và Nhà trường về tính chân thực của các nội dung cam đoan ở trên.</w:t>
+        <w:t>Mọi tài liệu tham khảo, hình vẽ, bảng biểu, công thức toán học và các trích dẫn sử dụng trong chuyên đề đều được tôi kiểm chứng và ghi rõ nguồn gốc xuất xứ cụ thể, minh bạch, tuân thủ đúng các quy định về sở hữu trí tuệ và đạo đức khoa học. Tôi xin hoàn toàn chịu trách nhiệm trước Giảng viên đánh giá chuyên đề và Nhà trường về tính chân thực của các nội dung cam đoan ở trên.</w:t>
       </w:r>
     </w:p>
     <w:p>
@@ -526,7 +526,7 @@
           <w:i w:val="0"/>
           <w:sz w:val="26"/>
         </w:rPr>
-        <w:t>TP. Hồ Chí Minh, ngày 17 tháng 6 năm 2026 Tác giả luận văn</w:t>
+        <w:t>TP. Hồ Chí Minh, ngày 17 tháng 6 năm 2026 Người thực hiện chuyên đề</w:t>
       </w:r>
     </w:p>
     <w:p>
@@ -2392,7 +2392,7 @@
           <w:i w:val="0"/>
           <w:sz w:val="26"/>
         </w:rPr>
-        <w:t>Sự ra đời của Mô hình Ngôn ngữ Lớn (LLM) và kỹ thuật Truy xuất Tạo sinh (Generative Retrieval) đã mở ra một hướng tiếp cận đột phá. Thay vì tìm kiếm sản phẩm trong không gian vector cứng nhắc hoặc sử dụng chỉ mục đảo ngược truyền thống, mô hình ngôn ngữ lớn có thể học cách "nhớ" toàn bộ danh mục sản phẩm trực tiếp vào trọng số của nó thông qua quá trình fine-tuning Seq2Seq và sinh trực tiếp mã định danh (ID) của sản phẩm tương thích từ truy vấn ngôn ngữ tự nhiên tự do của người dùng. Luận văn này tập trung nghiên cứu, hiện thực hóa và đánh giá đối chiếu các phương pháp này trên bộ dữ liệu rượu vang lớn.</w:t>
+        <w:t>Sự ra đời của Mô hình Ngôn ngữ Lớn (LLM) và kỹ thuật Truy xuất Tạo sinh (Generative Retrieval) đã mở ra một hướng tiếp cận đột phá. Thay vì tìm kiếm sản phẩm trong không gian vector cứng nhắc hoặc sử dụng chỉ mục đảo ngược truyền thống, mô hình ngôn ngữ lớn có thể học cách "nhớ" toàn bộ danh mục sản phẩm trực tiếp vào trọng số của nó thông qua quá trình fine-tuning Seq2Seq và sinh trực tiếp mã định danh (ID) của sản phẩm tương thích từ truy vấn ngôn ngữ tự nhiên tự do của người dùng. Chuyên đề này tập trung nghiên cứu, hiện thực hóa và đánh giá đối chiếu các phương pháp này trên bộ dữ liệu rượu vang lớn.</w:t>
       </w:r>
     </w:p>
     <w:p>
@@ -2553,7 +2553,7 @@
           <w:i w:val="0"/>
           <w:sz w:val="26"/>
         </w:rPr>
-        <w:t>Đối tượng nghiên cứu của luận văn bao gồm:</w:t>
+        <w:t>Đối tượng nghiên cứu của chuyên đề bao gồm:</w:t>
       </w:r>
     </w:p>
     <w:p>
@@ -2727,7 +2727,7 @@
           <w:i w:val="0"/>
           <w:sz w:val="26"/>
         </w:rPr>
-        <w:t>Luận văn áp dụng các phương pháp nghiên cứu khoa học sau:</w:t>
+        <w:t>Chuyên đề áp dụng các phương pháp nghiên cứu khoa học sau:</w:t>
       </w:r>
     </w:p>
     <w:p>
@@ -3305,7 +3305,7 @@
           <w:i w:val="0"/>
           <w:sz w:val="26"/>
         </w:rPr>
-        <w:t>Đề tài nghiên cứu này được thực hiện trong khuôn khổ chương trình đào tạo Thạc sĩ ngành Khoa học Máy tính tại Trường Đại học Tôn Đức Thắng. Chương trình đào tạo thạc sĩ của trường hướng tới việc trang bị cho học viên các kiến thức khoa học tiên tiến và kỹ năng thực hành nghiên cứu chuyên sâu, đặc biệt trong các lĩnh vực Trí tuệ Nhân tạo, Học máy và Xử lý Ngôn ngữ Tự nhiên. Sự hỗ trợ từ chương trình đào tạo là nền tảng định hướng học thuật vững chắc cho việc phát triển các kiến thức trong luận văn này.</w:t>
+        <w:t>Đề tài nghiên cứu này được thực hiện trong khuôn khổ chương trình đào tạo ngành Khoa học Máy tính tại Trường Đại học Tôn Đức Thắng. Chương trình đào tạo của trường hướng tới việc trang bị cho học viên các kiến thức khoa học tiên tiến và kỹ năng thực hành nghiên cứu chuyên sâu, đặc biệt trong các lĩnh vực Trí tuệ Nhân tạo, Học máy và Xử lý Ngôn ngữ Tự nhiên. Sự hỗ trợ từ chương trình đào tạo là nền tảng định hướng học thuật vững chắc cho việc phát triển các kiến thức trong chuyên đề này.</w:t>
       </w:r>
     </w:p>
     <w:p>
@@ -3450,7 +3450,7 @@
           <w:i w:val="0"/>
           <w:sz w:val="26"/>
         </w:rPr>
-        <w:t>Wine.com sử dụng mô hình lọc theo nội dung kết hợp sự tư vấn thủ công của các Sommelier. Tuy nhiên, cách tiếp cận này khó mở rộng quy mô (scalability) và không thể cung cấp lời lý giải cá nhân hóa theo thời gian thực cho từng truy vấn cụ thể của khách hàng. Điều này làm nổi bật khoảng trống nghiên cứu mà đề tài luận văn hướng tới: phát triển một Sommelier ảo tự động hóa hoàn toàn bằng trí tuệ nhân tạo, có thể hoạt động ở quy mô lớn với chi phí vận hành thấp.</w:t>
+        <w:t>Wine.com sử dụng mô hình lọc theo nội dung kết hợp sự tư vấn thủ công của các Sommelier. Tuy nhiên, cách tiếp cận này khó mở rộng quy mô (scalability) và không thể cung cấp lời lý giải cá nhân hóa theo thời gian thực cho từng truy vấn cụ thể của khách hàng. Điều này làm nổi bật khoảng trống nghiên cứu mà đề tài chuyên đề hướng tới: phát triển một Sommelier ảo tự động hóa hoàn toàn bằng trí tuệ nhân tạo, có thể hoạt động ở quy mô lớn với chi phí vận hành thấp.</w:t>
       </w:r>
     </w:p>
     <w:p>
@@ -3897,7 +3897,7 @@
           <w:i w:val="0"/>
           <w:sz w:val="26"/>
         </w:rPr>
-        <w:t>Dưới đây là bảng thống kê số liệu mô tả sơ bộ các đặc trưng chính của bộ dữ liệu Wine Reviews (Winemag-130k) và bộ dữ liệu Sapo thực tế được sử dụng trong luận văn. Các dữ liệu này phản ánh cấu trúc quy mô và sự phân bố giá trị, đóng vai trò nền tảng cho việc thiết lập thực nghiệm.</w:t>
+        <w:t>Dưới đây là bảng thống kê số liệu mô tả sơ bộ các đặc trưng chính của bộ dữ liệu Wine Reviews (Winemag-130k) và bộ dữ liệu Sapo thực tế được sử dụng trong chuyên đề. Các dữ liệu này phản ánh cấu trúc quy mô và sự phân bố giá trị, đóng vai trò nền tảng cho việc thiết lập thực nghiệm.</w:t>
       </w:r>
     </w:p>
     <w:p>
@@ -12213,7 +12213,7 @@
           <w:i w:val="0"/>
           <w:sz w:val="26"/>
         </w:rPr>
-        <w:t>Luận văn đã hoàn thành đầy đủ các mục tiêu nghiên cứu đề ra và đạt được các kết quả kỹ thuật và khoa học cụ thể sau:</w:t>
+        <w:t>Chuyên đề đã hoàn thành đầy đủ các mục tiêu nghiên cứu đề ra và đạt được các kết quả kỹ thuật và khoa học cụ thể sau:</w:t>
       </w:r>
     </w:p>
     <w:p>

</xml_diff>